<commit_message>
feat: add minister role support and update division filter options
</commit_message>
<xml_diff>
--- a/public/surat-undangan.docx
+++ b/public/surat-undangan.docx
@@ -463,15 +463,13 @@
           <w:rFonts w:ascii="Arial Narrow" w:hAnsi="Arial Narrow"/>
           <w:sz w:val="24"/>
           <w:szCs w:val="24"/>
-          <w:lang w:val="sv-SE"/>
-        </w:rPr>
-      </w:pPr>
-      <w:r>
-        <w:rPr>
-          <w:rFonts w:ascii="Arial Narrow" w:hAnsi="Arial Narrow"/>
-          <w:sz w:val="24"/>
-          <w:szCs w:val="24"/>
-          <w:lang w:val="sv-SE"/>
+        </w:rPr>
+      </w:pPr>
+      <w:r>
+        <w:rPr>
+          <w:rFonts w:ascii="Arial Narrow" w:hAnsi="Arial Narrow"/>
+          <w:sz w:val="24"/>
+          <w:szCs w:val="24"/>
         </w:rPr>
         <w:t>Lampiran</w:t>
       </w:r>
@@ -480,64 +478,9 @@
           <w:rFonts w:ascii="Arial Narrow" w:hAnsi="Arial Narrow"/>
           <w:sz w:val="24"/>
           <w:szCs w:val="24"/>
-          <w:lang w:val="sv-SE"/>
         </w:rPr>
         <w:tab/>
-        <w:t>:</w:t>
-      </w:r>
-      <w:r>
-        <w:rPr>
-          <w:rFonts w:ascii="Arial Narrow" w:hAnsi="Arial Narrow"/>
-          <w:sz w:val="24"/>
-          <w:szCs w:val="24"/>
-          <w:lang w:val="sv-SE"/>
-        </w:rPr>
-        <w:t xml:space="preserve"> </w:t>
-      </w:r>
-      <w:r>
-        <w:rPr>
-          <w:rFonts w:ascii="Arial Narrow" w:hAnsi="Arial Narrow"/>
-          <w:sz w:val="24"/>
-          <w:szCs w:val="24"/>
-          <w:lang w:val="sv-SE"/>
-        </w:rPr>
-        <w:t>1(s</w:t>
-      </w:r>
-      <w:r>
-        <w:rPr>
-          <w:rFonts w:ascii="Arial Narrow" w:hAnsi="Arial Narrow"/>
-          <w:sz w:val="24"/>
-          <w:szCs w:val="24"/>
-          <w:lang w:val="sv-SE"/>
-        </w:rPr>
-        <w:t>atu</w:t>
-      </w:r>
-      <w:r>
-        <w:rPr>
-          <w:rFonts w:ascii="Arial Narrow" w:hAnsi="Arial Narrow"/>
-          <w:sz w:val="24"/>
-          <w:szCs w:val="24"/>
-          <w:lang w:val="sv-SE"/>
-        </w:rPr>
-        <w:t>)</w:t>
-      </w:r>
-      <w:r>
-        <w:rPr>
-          <w:rFonts w:ascii="Arial Narrow" w:hAnsi="Arial Narrow"/>
-          <w:sz w:val="24"/>
-          <w:szCs w:val="24"/>
-          <w:lang w:val="sv-SE"/>
-        </w:rPr>
-        <w:t xml:space="preserve"> berkas</w:t>
-      </w:r>
-      <w:r>
-        <w:rPr>
-          <w:rFonts w:ascii="Arial Narrow" w:hAnsi="Arial Narrow"/>
-          <w:sz w:val="24"/>
-          <w:szCs w:val="24"/>
-          <w:lang w:val="sv-SE"/>
-        </w:rPr>
-        <w:t xml:space="preserve"> </w:t>
+        <w:t>: {{lampiran}}</w:t>
       </w:r>
     </w:p>
     <w:p>

</xml_diff>